<commit_message>
Pre-final version. Lots of stuff
</commit_message>
<xml_diff>
--- a/papers/Вавакин_Курсовая_Работа_2.docx
+++ b/papers/Вавакин_Курсовая_Работа_2.docx
@@ -1420,31 +1420,7 @@
               <w:sz w:val="28"/>
               <w:szCs w:val="28"/>
             </w:rPr>
-            <w:t>1.3</w:t>
-          </w:r>
-          <w:r>
-            <w:rPr>
-              <w:color w:val="0D0D0D" w:themeColor="text1" w:themeTint="F2"/>
-              <w:sz w:val="28"/>
-              <w:szCs w:val="28"/>
-            </w:rPr>
-            <w:t>.1</w:t>
-          </w:r>
-          <w:r>
-            <w:rPr>
-              <w:color w:val="0D0D0D" w:themeColor="text1" w:themeTint="F2"/>
-              <w:sz w:val="28"/>
-              <w:szCs w:val="28"/>
-            </w:rPr>
-            <w:t xml:space="preserve"> </w:t>
-          </w:r>
-          <w:r>
-            <w:rPr>
-              <w:color w:val="0D0D0D" w:themeColor="text1" w:themeTint="F2"/>
-              <w:sz w:val="28"/>
-              <w:szCs w:val="28"/>
-            </w:rPr>
-            <w:t>Универсальные облачные сервисы</w:t>
+            <w:t>1.3.1 Универсальные облачные сервисы</w:t>
           </w:r>
           <w:r>
             <w:rPr>
@@ -1480,31 +1456,7 @@
               <w:sz w:val="28"/>
               <w:szCs w:val="28"/>
             </w:rPr>
-            <w:t>1.3</w:t>
-          </w:r>
-          <w:r>
-            <w:rPr>
-              <w:color w:val="0D0D0D" w:themeColor="text1" w:themeTint="F2"/>
-              <w:sz w:val="28"/>
-              <w:szCs w:val="28"/>
-            </w:rPr>
-            <w:t>.2</w:t>
-          </w:r>
-          <w:r>
-            <w:rPr>
-              <w:color w:val="0D0D0D" w:themeColor="text1" w:themeTint="F2"/>
-              <w:sz w:val="28"/>
-              <w:szCs w:val="28"/>
-            </w:rPr>
-            <w:t xml:space="preserve"> </w:t>
-          </w:r>
-          <w:r>
-            <w:rPr>
-              <w:color w:val="0D0D0D" w:themeColor="text1" w:themeTint="F2"/>
-              <w:sz w:val="28"/>
-              <w:szCs w:val="28"/>
-            </w:rPr>
-            <w:t xml:space="preserve">Коммерческие системы </w:t>
+            <w:t xml:space="preserve">1.3.2 Коммерческие системы </w:t>
           </w:r>
           <w:r>
             <w:rPr>
@@ -1548,23 +1500,7 @@
               <w:sz w:val="28"/>
               <w:szCs w:val="28"/>
             </w:rPr>
-            <w:t>1.3</w:t>
-          </w:r>
-          <w:r>
-            <w:rPr>
-              <w:color w:val="0D0D0D" w:themeColor="text1" w:themeTint="F2"/>
-              <w:sz w:val="28"/>
-              <w:szCs w:val="28"/>
-            </w:rPr>
-            <w:t>.3</w:t>
-          </w:r>
-          <w:r>
-            <w:rPr>
-              <w:color w:val="0D0D0D" w:themeColor="text1" w:themeTint="F2"/>
-              <w:sz w:val="28"/>
-              <w:szCs w:val="28"/>
-            </w:rPr>
-            <w:t xml:space="preserve"> </w:t>
+            <w:t xml:space="preserve">1.3.3 </w:t>
           </w:r>
           <w:r>
             <w:rPr>
@@ -7239,17 +7175,33 @@
           <w:color w:val="0D0D0D" w:themeColor="text1" w:themeTint="F2"/>
           <w:sz w:val="28"/>
           <w:szCs w:val="28"/>
-          <w:lang w:val="en-US"/>
-        </w:rPr>
-        <w:t xml:space="preserve">– </w:t>
-      </w:r>
-      <w:r>
-        <w:rPr>
-          <w:color w:val="0D0D0D" w:themeColor="text1" w:themeTint="F2"/>
-          <w:sz w:val="28"/>
-          <w:szCs w:val="28"/>
-        </w:rPr>
-        <w:t>а также встроенная система аутентификации и авторизации, обработка форм, валидация данных, механизмы кэширования, миграции баз данных</w:t>
+        </w:rPr>
+        <w:t xml:space="preserve">Кроме того, в возможности </w:t>
+      </w:r>
+      <w:r>
+        <w:rPr>
+          <w:color w:val="0D0D0D" w:themeColor="text1" w:themeTint="F2"/>
+          <w:sz w:val="28"/>
+          <w:szCs w:val="28"/>
+          <w:lang w:val="en-US"/>
+        </w:rPr>
+        <w:t xml:space="preserve">Django </w:t>
+      </w:r>
+      <w:r>
+        <w:rPr>
+          <w:color w:val="0D0D0D" w:themeColor="text1" w:themeTint="F2"/>
+          <w:sz w:val="28"/>
+          <w:szCs w:val="28"/>
+        </w:rPr>
+        <w:t>входят</w:t>
+      </w:r>
+      <w:r>
+        <w:rPr>
+          <w:color w:val="0D0D0D" w:themeColor="text1" w:themeTint="F2"/>
+          <w:sz w:val="28"/>
+          <w:szCs w:val="28"/>
+        </w:rPr>
+        <w:t xml:space="preserve"> встроенная система аутентификации и авторизации, обработка форм, валидация данных, механизмы кэширования, миграции баз данных</w:t>
       </w:r>
       <w:r>
         <w:rPr>
@@ -7384,110 +7336,491 @@
           <w:szCs w:val="28"/>
         </w:rPr>
       </w:pPr>
+    </w:p>
+    <w:p>
+      <w:pPr>
+        <w:spacing w:line="360" w:lineRule="auto"/>
+        <w:ind w:firstLine="709"/>
+        <w:jc w:val="both"/>
+        <w:rPr>
+          <w:b/>
+          <w:color w:val="0D0D0D" w:themeColor="text1" w:themeTint="F2"/>
+          <w:sz w:val="28"/>
+          <w:szCs w:val="28"/>
+          <w:lang w:val="en-US"/>
+        </w:rPr>
+      </w:pPr>
+      <w:r>
+        <w:rPr>
+          <w:b/>
+          <w:color w:val="0D0D0D" w:themeColor="text1" w:themeTint="F2"/>
+          <w:sz w:val="28"/>
+          <w:szCs w:val="28"/>
+          <w:lang w:val="en-US"/>
+        </w:rPr>
+        <w:t xml:space="preserve">2.3 </w:t>
+      </w:r>
+      <w:r>
+        <w:rPr>
+          <w:b/>
+          <w:color w:val="0D0D0D" w:themeColor="text1" w:themeTint="F2"/>
+          <w:sz w:val="28"/>
+          <w:szCs w:val="28"/>
+        </w:rPr>
+        <w:t>СУБД</w:t>
+      </w:r>
+    </w:p>
+    <w:p>
+      <w:pPr>
+        <w:spacing w:line="360" w:lineRule="auto"/>
+        <w:ind w:firstLine="709"/>
+        <w:jc w:val="both"/>
+        <w:rPr>
+          <w:color w:val="0D0D0D" w:themeColor="text1" w:themeTint="F2"/>
+          <w:sz w:val="28"/>
+          <w:szCs w:val="28"/>
+          <w:lang w:val="en-US"/>
+        </w:rPr>
+      </w:pPr>
+    </w:p>
+    <w:p>
+      <w:pPr>
+        <w:spacing w:line="360" w:lineRule="auto"/>
+        <w:ind w:firstLine="709"/>
+        <w:jc w:val="both"/>
+        <w:rPr>
+          <w:color w:val="0D0D0D" w:themeColor="text1" w:themeTint="F2"/>
+          <w:sz w:val="28"/>
+          <w:szCs w:val="28"/>
+        </w:rPr>
+      </w:pPr>
+      <w:r>
+        <w:rPr>
+          <w:color w:val="0D0D0D" w:themeColor="text1" w:themeTint="F2"/>
+          <w:sz w:val="28"/>
+          <w:szCs w:val="28"/>
+          <w:lang w:val="en-US"/>
+        </w:rPr>
+        <w:t xml:space="preserve">Django </w:t>
+      </w:r>
+      <w:r>
+        <w:rPr>
+          <w:color w:val="0D0D0D" w:themeColor="text1" w:themeTint="F2"/>
+          <w:sz w:val="28"/>
+          <w:szCs w:val="28"/>
+        </w:rPr>
+        <w:t>по умолчанию использует интегрированную</w:t>
+      </w:r>
+      <w:r>
+        <w:rPr>
+          <w:color w:val="0D0D0D" w:themeColor="text1" w:themeTint="F2"/>
+          <w:sz w:val="28"/>
+          <w:szCs w:val="28"/>
+        </w:rPr>
+        <w:t xml:space="preserve"> СУБД </w:t>
+      </w:r>
+      <w:r>
+        <w:rPr>
+          <w:color w:val="0D0D0D" w:themeColor="text1" w:themeTint="F2"/>
+          <w:sz w:val="28"/>
+          <w:szCs w:val="28"/>
+          <w:lang w:val="en-US"/>
+        </w:rPr>
+        <w:t>SQLite</w:t>
+      </w:r>
+      <w:r>
+        <w:rPr>
+          <w:color w:val="0D0D0D" w:themeColor="text1" w:themeTint="F2"/>
+          <w:sz w:val="28"/>
+          <w:szCs w:val="28"/>
+          <w:lang w:val="en-US"/>
+        </w:rPr>
+        <w:t xml:space="preserve"> [</w:t>
+      </w:r>
+      <w:r>
+        <w:rPr>
+          <w:color w:val="0D0D0D" w:themeColor="text1" w:themeTint="F2"/>
+          <w:sz w:val="28"/>
+          <w:szCs w:val="28"/>
+        </w:rPr>
+        <w:t>5</w:t>
+      </w:r>
+      <w:r>
+        <w:rPr>
+          <w:color w:val="0D0D0D" w:themeColor="text1" w:themeTint="F2"/>
+          <w:sz w:val="28"/>
+          <w:szCs w:val="28"/>
+          <w:lang w:val="en-US"/>
+        </w:rPr>
+        <w:t>]</w:t>
+      </w:r>
+      <w:r>
+        <w:rPr>
+          <w:color w:val="0D0D0D" w:themeColor="text1" w:themeTint="F2"/>
+          <w:sz w:val="28"/>
+          <w:szCs w:val="28"/>
+          <w:lang w:val="en-US"/>
+        </w:rPr>
+        <w:t xml:space="preserve">. </w:t>
+      </w:r>
+      <w:r>
+        <w:rPr>
+          <w:color w:val="0D0D0D" w:themeColor="text1" w:themeTint="F2"/>
+          <w:sz w:val="28"/>
+          <w:szCs w:val="28"/>
+        </w:rPr>
+        <w:t>Ее главное преимущество – отсутствие необходимости настройки отдельного сервера: все данные хранятся в едином файле, что упрощает развертывание локальной среды</w:t>
+      </w:r>
+      <w:r>
+        <w:rPr>
+          <w:color w:val="0D0D0D" w:themeColor="text1" w:themeTint="F2"/>
+          <w:sz w:val="28"/>
+          <w:szCs w:val="28"/>
+        </w:rPr>
+        <w:t>.</w:t>
+      </w:r>
+    </w:p>
+    <w:p>
+      <w:pPr>
+        <w:spacing w:line="360" w:lineRule="auto"/>
+        <w:ind w:firstLine="709"/>
+        <w:jc w:val="both"/>
+        <w:rPr>
+          <w:color w:val="0D0D0D" w:themeColor="text1" w:themeTint="F2"/>
+          <w:sz w:val="28"/>
+          <w:szCs w:val="28"/>
+        </w:rPr>
+      </w:pPr>
+      <w:r>
+        <w:rPr>
+          <w:color w:val="0D0D0D" w:themeColor="text1" w:themeTint="F2"/>
+          <w:sz w:val="28"/>
+          <w:szCs w:val="28"/>
+          <w:lang w:val="en-US"/>
+        </w:rPr>
+        <w:lastRenderedPageBreak/>
+        <w:t xml:space="preserve">SQLite </w:t>
+      </w:r>
+      <w:r>
+        <w:rPr>
+          <w:color w:val="0D0D0D" w:themeColor="text1" w:themeTint="F2"/>
+          <w:sz w:val="28"/>
+          <w:szCs w:val="28"/>
+        </w:rPr>
+        <w:t xml:space="preserve">поддерживает транзакции, следующие набору требований </w:t>
+      </w:r>
+      <w:r>
+        <w:rPr>
+          <w:color w:val="0D0D0D" w:themeColor="text1" w:themeTint="F2"/>
+          <w:sz w:val="28"/>
+          <w:szCs w:val="28"/>
+          <w:lang w:val="en-US"/>
+        </w:rPr>
+        <w:t>ACID</w:t>
+      </w:r>
+      <w:r>
+        <w:rPr>
+          <w:color w:val="0D0D0D" w:themeColor="text1" w:themeTint="F2"/>
+          <w:sz w:val="28"/>
+          <w:szCs w:val="28"/>
+        </w:rPr>
+        <w:t>, который включает в себя атомарность, согласованность, изолированность и долговечность. Это гарантирует целостность данных при одновременном доступе нескольких пользователей.</w:t>
+      </w:r>
+    </w:p>
+    <w:p>
+      <w:pPr>
+        <w:spacing w:line="360" w:lineRule="auto"/>
+        <w:ind w:firstLine="709"/>
+        <w:jc w:val="both"/>
+        <w:rPr>
+          <w:color w:val="0D0D0D" w:themeColor="text1" w:themeTint="F2"/>
+          <w:sz w:val="28"/>
+          <w:szCs w:val="28"/>
+          <w:lang w:val="en-US"/>
+        </w:rPr>
+      </w:pPr>
+      <w:r>
+        <w:rPr>
+          <w:color w:val="0D0D0D" w:themeColor="text1" w:themeTint="F2"/>
+          <w:sz w:val="28"/>
+          <w:szCs w:val="28"/>
+        </w:rPr>
+        <w:t xml:space="preserve">«Встраиваемость» </w:t>
+      </w:r>
+      <w:r>
+        <w:rPr>
+          <w:color w:val="0D0D0D" w:themeColor="text1" w:themeTint="F2"/>
+          <w:sz w:val="28"/>
+          <w:szCs w:val="28"/>
+          <w:lang w:val="en-US"/>
+        </w:rPr>
+        <w:t xml:space="preserve">SQLite </w:t>
+      </w:r>
+      <w:r>
+        <w:rPr>
+          <w:color w:val="0D0D0D" w:themeColor="text1" w:themeTint="F2"/>
+          <w:sz w:val="28"/>
+          <w:szCs w:val="28"/>
+        </w:rPr>
+        <w:t xml:space="preserve">означает, что она не использует парадигмы «клиент-сервер», а движок </w:t>
+      </w:r>
+      <w:r>
+        <w:rPr>
+          <w:color w:val="0D0D0D" w:themeColor="text1" w:themeTint="F2"/>
+          <w:sz w:val="28"/>
+          <w:szCs w:val="28"/>
+          <w:lang w:val="en-US"/>
+        </w:rPr>
+        <w:t xml:space="preserve">SQLite </w:t>
+      </w:r>
+      <w:r>
+        <w:rPr>
+          <w:color w:val="0D0D0D" w:themeColor="text1" w:themeTint="F2"/>
+          <w:sz w:val="28"/>
+          <w:szCs w:val="28"/>
+        </w:rPr>
+        <w:t>представляет собой библиотеку, становящ</w:t>
+      </w:r>
+      <w:r>
+        <w:rPr>
+          <w:color w:val="0D0D0D" w:themeColor="text1" w:themeTint="F2"/>
+          <w:sz w:val="28"/>
+          <w:szCs w:val="28"/>
+        </w:rPr>
+        <w:t>ую</w:t>
+      </w:r>
+      <w:r>
+        <w:rPr>
+          <w:color w:val="0D0D0D" w:themeColor="text1" w:themeTint="F2"/>
+          <w:sz w:val="28"/>
+          <w:szCs w:val="28"/>
+        </w:rPr>
+        <w:t xml:space="preserve">ся составной частью программы в результате компоновки. Таким образом, протоколом обмена выступают вызовы </w:t>
+      </w:r>
+      <w:r>
+        <w:rPr>
+          <w:color w:val="0D0D0D" w:themeColor="text1" w:themeTint="F2"/>
+          <w:sz w:val="28"/>
+          <w:szCs w:val="28"/>
+          <w:lang w:val="en-US"/>
+        </w:rPr>
+        <w:t xml:space="preserve">API </w:t>
+      </w:r>
+      <w:r>
+        <w:rPr>
+          <w:color w:val="0D0D0D" w:themeColor="text1" w:themeTint="F2"/>
+          <w:sz w:val="28"/>
+          <w:szCs w:val="28"/>
+        </w:rPr>
+        <w:t xml:space="preserve">библиотеки </w:t>
+      </w:r>
+      <w:r>
+        <w:rPr>
+          <w:color w:val="0D0D0D" w:themeColor="text1" w:themeTint="F2"/>
+          <w:sz w:val="28"/>
+          <w:szCs w:val="28"/>
+          <w:lang w:val="en-US"/>
+        </w:rPr>
+        <w:t>SQLite.</w:t>
+      </w:r>
+    </w:p>
+    <w:p>
+      <w:pPr>
+        <w:spacing w:line="360" w:lineRule="auto"/>
+        <w:ind w:firstLine="709"/>
+        <w:jc w:val="both"/>
+        <w:rPr>
+          <w:color w:val="0D0D0D" w:themeColor="text1" w:themeTint="F2"/>
+          <w:sz w:val="28"/>
+          <w:szCs w:val="28"/>
+        </w:rPr>
+      </w:pPr>
+      <w:r>
+        <w:rPr>
+          <w:color w:val="0D0D0D" w:themeColor="text1" w:themeTint="F2"/>
+          <w:sz w:val="28"/>
+          <w:szCs w:val="28"/>
+          <w:lang w:val="en-US"/>
+        </w:rPr>
+        <w:t xml:space="preserve">SQLite </w:t>
+      </w:r>
+      <w:r>
+        <w:rPr>
+          <w:color w:val="0D0D0D" w:themeColor="text1" w:themeTint="F2"/>
+          <w:sz w:val="28"/>
+          <w:szCs w:val="28"/>
+        </w:rPr>
+        <w:t>обладает низкой масштабируемостью</w:t>
+      </w:r>
+      <w:r>
+        <w:rPr>
+          <w:color w:val="0D0D0D" w:themeColor="text1" w:themeTint="F2"/>
+          <w:sz w:val="28"/>
+          <w:szCs w:val="28"/>
+        </w:rPr>
+        <w:t xml:space="preserve"> и обычно не подходит для эксплуатации в условиях высокой нагрузки и больших объемов данных, однако эта СУБД</w:t>
+      </w:r>
+      <w:r>
+        <w:rPr>
+          <w:color w:val="0D0D0D" w:themeColor="text1" w:themeTint="F2"/>
+          <w:sz w:val="28"/>
+          <w:szCs w:val="28"/>
+        </w:rPr>
+        <w:t xml:space="preserve"> отлично подходит для задач разработки и небольших проектов.</w:t>
+      </w:r>
+    </w:p>
+    <w:p>
+      <w:pPr>
+        <w:spacing w:line="360" w:lineRule="auto"/>
+        <w:ind w:firstLine="709"/>
+        <w:jc w:val="both"/>
+        <w:rPr>
+          <w:color w:val="0D0D0D" w:themeColor="text1" w:themeTint="F2"/>
+          <w:sz w:val="28"/>
+          <w:szCs w:val="28"/>
+        </w:rPr>
+      </w:pPr>
+      <w:r>
+        <w:rPr>
+          <w:color w:val="0D0D0D" w:themeColor="text1" w:themeTint="F2"/>
+          <w:sz w:val="28"/>
+          <w:szCs w:val="28"/>
+        </w:rPr>
+        <w:t xml:space="preserve">Благодаря </w:t>
+      </w:r>
+      <w:r>
+        <w:rPr>
+          <w:color w:val="0D0D0D" w:themeColor="text1" w:themeTint="F2"/>
+          <w:sz w:val="28"/>
+          <w:szCs w:val="28"/>
+        </w:rPr>
+        <w:t>абстракции уровня базы данных, предоставляемой</w:t>
+      </w:r>
+      <w:r>
+        <w:rPr>
+          <w:color w:val="0D0D0D" w:themeColor="text1" w:themeTint="F2"/>
+          <w:sz w:val="28"/>
+          <w:szCs w:val="28"/>
+          <w:lang w:val="en-US"/>
+        </w:rPr>
+        <w:t xml:space="preserve"> </w:t>
+      </w:r>
+      <w:r>
+        <w:rPr>
+          <w:color w:val="0D0D0D" w:themeColor="text1" w:themeTint="F2"/>
+          <w:sz w:val="28"/>
+          <w:szCs w:val="28"/>
+        </w:rPr>
+        <w:t xml:space="preserve">объектно-реляционной моделью </w:t>
+      </w:r>
+      <w:r>
+        <w:rPr>
+          <w:color w:val="0D0D0D" w:themeColor="text1" w:themeTint="F2"/>
+          <w:sz w:val="28"/>
+          <w:szCs w:val="28"/>
+          <w:lang w:val="en-US"/>
+        </w:rPr>
+        <w:t>Django</w:t>
+      </w:r>
+      <w:r>
+        <w:rPr>
+          <w:color w:val="0D0D0D" w:themeColor="text1" w:themeTint="F2"/>
+          <w:sz w:val="28"/>
+          <w:szCs w:val="28"/>
+          <w:lang w:val="en-US"/>
+        </w:rPr>
+        <w:t xml:space="preserve">, </w:t>
+      </w:r>
+      <w:r>
+        <w:rPr>
+          <w:color w:val="0D0D0D" w:themeColor="text1" w:themeTint="F2"/>
+          <w:sz w:val="28"/>
+          <w:szCs w:val="28"/>
+        </w:rPr>
+        <w:t>переход с текущей базы данных на более масштабируемую потребует лишь изменения настроек подключения в файле конфигурации, без необходимости переписывания запросов</w:t>
+      </w:r>
+      <w:r>
+        <w:rPr>
+          <w:color w:val="0D0D0D" w:themeColor="text1" w:themeTint="F2"/>
+          <w:sz w:val="28"/>
+          <w:szCs w:val="28"/>
+          <w:lang w:val="en-US"/>
+        </w:rPr>
+        <w:t>.</w:t>
+      </w:r>
+      <w:r>
+        <w:rPr>
+          <w:color w:val="0D0D0D" w:themeColor="text1" w:themeTint="F2"/>
+          <w:sz w:val="28"/>
+          <w:szCs w:val="28"/>
+        </w:rPr>
+        <w:t xml:space="preserve"> Это позволяет масштабировать систему поэтапно</w:t>
+      </w:r>
+      <w:r>
+        <w:rPr>
+          <w:color w:val="0D0D0D" w:themeColor="text1" w:themeTint="F2"/>
+          <w:sz w:val="28"/>
+          <w:szCs w:val="28"/>
+          <w:lang w:val="en-US"/>
+        </w:rPr>
+        <w:t xml:space="preserve">, </w:t>
+      </w:r>
+      <w:r>
+        <w:rPr>
+          <w:color w:val="0D0D0D" w:themeColor="text1" w:themeTint="F2"/>
+          <w:sz w:val="28"/>
+          <w:szCs w:val="28"/>
+        </w:rPr>
+        <w:t>начиная с малого числа пользователей и расширяя функционал по мере роста потребностей.</w:t>
+      </w:r>
+    </w:p>
+    <w:p>
+      <w:pPr>
+        <w:spacing w:line="360" w:lineRule="auto"/>
+        <w:ind w:firstLine="709"/>
+        <w:jc w:val="both"/>
+        <w:rPr>
+          <w:color w:val="0D0D0D" w:themeColor="text1" w:themeTint="F2"/>
+          <w:sz w:val="28"/>
+          <w:szCs w:val="28"/>
+        </w:rPr>
+      </w:pPr>
+      <w:r>
+        <w:rPr>
+          <w:color w:val="0D0D0D" w:themeColor="text1" w:themeTint="F2"/>
+          <w:sz w:val="28"/>
+          <w:szCs w:val="28"/>
+        </w:rPr>
+        <w:t xml:space="preserve">Одной из предпочтительных СУБД для разрабатываемой системы может быть </w:t>
+      </w:r>
+      <w:r>
+        <w:rPr>
+          <w:color w:val="0D0D0D" w:themeColor="text1" w:themeTint="F2"/>
+          <w:sz w:val="28"/>
+          <w:szCs w:val="28"/>
+          <w:lang w:val="en-US"/>
+        </w:rPr>
+        <w:t>PostgreSQL</w:t>
+      </w:r>
+      <w:r>
+        <w:rPr>
+          <w:color w:val="0D0D0D" w:themeColor="text1" w:themeTint="F2"/>
+          <w:sz w:val="28"/>
+          <w:szCs w:val="28"/>
+          <w:lang w:val="en-US"/>
+        </w:rPr>
+        <w:t xml:space="preserve"> [</w:t>
+      </w:r>
+      <w:r>
+        <w:rPr>
+          <w:color w:val="0D0D0D" w:themeColor="text1" w:themeTint="F2"/>
+          <w:sz w:val="28"/>
+          <w:szCs w:val="28"/>
+        </w:rPr>
+        <w:t>6</w:t>
+      </w:r>
       <w:bookmarkStart w:id="0" w:name="_GoBack"/>
       <w:bookmarkEnd w:id="0"/>
-    </w:p>
-    <w:p>
-      <w:pPr>
-        <w:spacing w:line="360" w:lineRule="auto"/>
-        <w:ind w:firstLine="709"/>
-        <w:jc w:val="both"/>
-        <w:rPr>
-          <w:b/>
-          <w:color w:val="0D0D0D" w:themeColor="text1" w:themeTint="F2"/>
-          <w:sz w:val="28"/>
-          <w:szCs w:val="28"/>
-          <w:lang w:val="en-US"/>
-        </w:rPr>
-      </w:pPr>
-      <w:r>
-        <w:rPr>
-          <w:b/>
-          <w:color w:val="0D0D0D" w:themeColor="text1" w:themeTint="F2"/>
-          <w:sz w:val="28"/>
-          <w:szCs w:val="28"/>
-          <w:lang w:val="en-US"/>
-        </w:rPr>
-        <w:t xml:space="preserve">2.3 </w:t>
-      </w:r>
-      <w:r>
-        <w:rPr>
-          <w:b/>
-          <w:color w:val="0D0D0D" w:themeColor="text1" w:themeTint="F2"/>
-          <w:sz w:val="28"/>
-          <w:szCs w:val="28"/>
-        </w:rPr>
-        <w:t>СУБД</w:t>
-      </w:r>
-    </w:p>
-    <w:p>
-      <w:pPr>
-        <w:spacing w:line="360" w:lineRule="auto"/>
-        <w:ind w:firstLine="709"/>
-        <w:jc w:val="both"/>
-        <w:rPr>
-          <w:color w:val="0D0D0D" w:themeColor="text1" w:themeTint="F2"/>
-          <w:sz w:val="28"/>
-          <w:szCs w:val="28"/>
-          <w:lang w:val="en-US"/>
-        </w:rPr>
-      </w:pPr>
-    </w:p>
-    <w:p>
-      <w:pPr>
-        <w:spacing w:line="360" w:lineRule="auto"/>
-        <w:ind w:firstLine="709"/>
-        <w:jc w:val="both"/>
-        <w:rPr>
-          <w:color w:val="0D0D0D" w:themeColor="text1" w:themeTint="F2"/>
-          <w:sz w:val="28"/>
-          <w:szCs w:val="28"/>
-        </w:rPr>
-      </w:pPr>
-      <w:r>
-        <w:rPr>
-          <w:color w:val="0D0D0D" w:themeColor="text1" w:themeTint="F2"/>
-          <w:sz w:val="28"/>
-          <w:szCs w:val="28"/>
-          <w:lang w:val="en-US"/>
-        </w:rPr>
-        <w:t xml:space="preserve">Django </w:t>
-      </w:r>
-      <w:r>
-        <w:rPr>
-          <w:color w:val="0D0D0D" w:themeColor="text1" w:themeTint="F2"/>
-          <w:sz w:val="28"/>
-          <w:szCs w:val="28"/>
-        </w:rPr>
-        <w:t xml:space="preserve">использует встраиваемую СУБД </w:t>
-      </w:r>
-      <w:r>
-        <w:rPr>
-          <w:color w:val="0D0D0D" w:themeColor="text1" w:themeTint="F2"/>
-          <w:sz w:val="28"/>
-          <w:szCs w:val="28"/>
-          <w:lang w:val="en-US"/>
-        </w:rPr>
-        <w:t>SQLite</w:t>
-      </w:r>
-      <w:r>
-        <w:rPr>
-          <w:color w:val="0D0D0D" w:themeColor="text1" w:themeTint="F2"/>
-          <w:sz w:val="28"/>
-          <w:szCs w:val="28"/>
-          <w:lang w:val="en-US"/>
-        </w:rPr>
-        <w:t xml:space="preserve"> [1</w:t>
-      </w:r>
-      <w:r>
-        <w:rPr>
-          <w:color w:val="0D0D0D" w:themeColor="text1" w:themeTint="F2"/>
-          <w:sz w:val="28"/>
-          <w:szCs w:val="28"/>
-          <w:lang w:val="en-US"/>
-        </w:rPr>
-        <w:t>0</w:t>
-      </w:r>
       <w:r>
         <w:rPr>
           <w:color w:val="0D0D0D" w:themeColor="text1" w:themeTint="F2"/>
@@ -7502,278 +7835,6 @@
           <w:color w:val="0D0D0D" w:themeColor="text1" w:themeTint="F2"/>
           <w:sz w:val="28"/>
           <w:szCs w:val="28"/>
-          <w:lang w:val="en-US"/>
-        </w:rPr>
-        <w:t xml:space="preserve">. </w:t>
-      </w:r>
-      <w:r>
-        <w:rPr>
-          <w:color w:val="0D0D0D" w:themeColor="text1" w:themeTint="F2"/>
-          <w:sz w:val="28"/>
-          <w:szCs w:val="28"/>
-        </w:rPr>
-        <w:t xml:space="preserve">Она по умолчанию встроена в </w:t>
-      </w:r>
-      <w:r>
-        <w:rPr>
-          <w:color w:val="0D0D0D" w:themeColor="text1" w:themeTint="F2"/>
-          <w:sz w:val="28"/>
-          <w:szCs w:val="28"/>
-          <w:lang w:val="en-US"/>
-        </w:rPr>
-        <w:t xml:space="preserve">Python, </w:t>
-      </w:r>
-      <w:r>
-        <w:rPr>
-          <w:color w:val="0D0D0D" w:themeColor="text1" w:themeTint="F2"/>
-          <w:sz w:val="28"/>
-          <w:szCs w:val="28"/>
-        </w:rPr>
-        <w:t>что значительно упрощает настройку и использование для разработки, поскольку исключается необходимость в установке отдельного сервера базы данных.</w:t>
-      </w:r>
-    </w:p>
-    <w:p>
-      <w:pPr>
-        <w:spacing w:line="360" w:lineRule="auto"/>
-        <w:ind w:firstLine="709"/>
-        <w:jc w:val="both"/>
-        <w:rPr>
-          <w:color w:val="0D0D0D" w:themeColor="text1" w:themeTint="F2"/>
-          <w:sz w:val="28"/>
-          <w:szCs w:val="28"/>
-          <w:lang w:val="en-US"/>
-        </w:rPr>
-      </w:pPr>
-      <w:r>
-        <w:rPr>
-          <w:color w:val="0D0D0D" w:themeColor="text1" w:themeTint="F2"/>
-          <w:sz w:val="28"/>
-          <w:szCs w:val="28"/>
-        </w:rPr>
-        <w:lastRenderedPageBreak/>
-        <w:t xml:space="preserve">«Встраиваемость» </w:t>
-      </w:r>
-      <w:r>
-        <w:rPr>
-          <w:color w:val="0D0D0D" w:themeColor="text1" w:themeTint="F2"/>
-          <w:sz w:val="28"/>
-          <w:szCs w:val="28"/>
-          <w:lang w:val="en-US"/>
-        </w:rPr>
-        <w:t xml:space="preserve">SQLite </w:t>
-      </w:r>
-      <w:r>
-        <w:rPr>
-          <w:color w:val="0D0D0D" w:themeColor="text1" w:themeTint="F2"/>
-          <w:sz w:val="28"/>
-          <w:szCs w:val="28"/>
-        </w:rPr>
-        <w:t xml:space="preserve">означает, что она не использует парадигмы «клиент-сервер», а движок </w:t>
-      </w:r>
-      <w:r>
-        <w:rPr>
-          <w:color w:val="0D0D0D" w:themeColor="text1" w:themeTint="F2"/>
-          <w:sz w:val="28"/>
-          <w:szCs w:val="28"/>
-          <w:lang w:val="en-US"/>
-        </w:rPr>
-        <w:t xml:space="preserve">SQLite </w:t>
-      </w:r>
-      <w:r>
-        <w:rPr>
-          <w:color w:val="0D0D0D" w:themeColor="text1" w:themeTint="F2"/>
-          <w:sz w:val="28"/>
-          <w:szCs w:val="28"/>
-        </w:rPr>
-        <w:t>представляет собой библиотеку, становящ</w:t>
-      </w:r>
-      <w:r>
-        <w:rPr>
-          <w:color w:val="0D0D0D" w:themeColor="text1" w:themeTint="F2"/>
-          <w:sz w:val="28"/>
-          <w:szCs w:val="28"/>
-        </w:rPr>
-        <w:t>ую</w:t>
-      </w:r>
-      <w:r>
-        <w:rPr>
-          <w:color w:val="0D0D0D" w:themeColor="text1" w:themeTint="F2"/>
-          <w:sz w:val="28"/>
-          <w:szCs w:val="28"/>
-        </w:rPr>
-        <w:t xml:space="preserve">ся составной частью программы в результате компоновки. Таким образом, протоколом обмена выступают вызовы </w:t>
-      </w:r>
-      <w:r>
-        <w:rPr>
-          <w:color w:val="0D0D0D" w:themeColor="text1" w:themeTint="F2"/>
-          <w:sz w:val="28"/>
-          <w:szCs w:val="28"/>
-          <w:lang w:val="en-US"/>
-        </w:rPr>
-        <w:t xml:space="preserve">API </w:t>
-      </w:r>
-      <w:r>
-        <w:rPr>
-          <w:color w:val="0D0D0D" w:themeColor="text1" w:themeTint="F2"/>
-          <w:sz w:val="28"/>
-          <w:szCs w:val="28"/>
-        </w:rPr>
-        <w:t xml:space="preserve">библиотеки </w:t>
-      </w:r>
-      <w:r>
-        <w:rPr>
-          <w:color w:val="0D0D0D" w:themeColor="text1" w:themeTint="F2"/>
-          <w:sz w:val="28"/>
-          <w:szCs w:val="28"/>
-          <w:lang w:val="en-US"/>
-        </w:rPr>
-        <w:t>SQLite.</w:t>
-      </w:r>
-    </w:p>
-    <w:p>
-      <w:pPr>
-        <w:spacing w:line="360" w:lineRule="auto"/>
-        <w:ind w:firstLine="709"/>
-        <w:jc w:val="both"/>
-        <w:rPr>
-          <w:color w:val="0D0D0D" w:themeColor="text1" w:themeTint="F2"/>
-          <w:sz w:val="28"/>
-          <w:szCs w:val="28"/>
-        </w:rPr>
-      </w:pPr>
-      <w:r>
-        <w:rPr>
-          <w:color w:val="0D0D0D" w:themeColor="text1" w:themeTint="F2"/>
-          <w:sz w:val="28"/>
-          <w:szCs w:val="28"/>
-          <w:lang w:val="en-US"/>
-        </w:rPr>
-        <w:t xml:space="preserve">SQLite </w:t>
-      </w:r>
-      <w:r>
-        <w:rPr>
-          <w:color w:val="0D0D0D" w:themeColor="text1" w:themeTint="F2"/>
-          <w:sz w:val="28"/>
-          <w:szCs w:val="28"/>
-        </w:rPr>
-        <w:t>обладает низкой масштабируемостью, но отлично подходит для задач разработки и небольших проектов.</w:t>
-      </w:r>
-    </w:p>
-    <w:p>
-      <w:pPr>
-        <w:spacing w:line="360" w:lineRule="auto"/>
-        <w:ind w:firstLine="709"/>
-        <w:jc w:val="both"/>
-        <w:rPr>
-          <w:color w:val="0D0D0D" w:themeColor="text1" w:themeTint="F2"/>
-          <w:sz w:val="28"/>
-          <w:szCs w:val="28"/>
-          <w:lang w:val="en-US"/>
-        </w:rPr>
-      </w:pPr>
-      <w:r>
-        <w:rPr>
-          <w:color w:val="0D0D0D" w:themeColor="text1" w:themeTint="F2"/>
-          <w:sz w:val="28"/>
-          <w:szCs w:val="28"/>
-        </w:rPr>
-        <w:t xml:space="preserve">Благодаря возможностям фреймворка </w:t>
-      </w:r>
-      <w:r>
-        <w:rPr>
-          <w:color w:val="0D0D0D" w:themeColor="text1" w:themeTint="F2"/>
-          <w:sz w:val="28"/>
-          <w:szCs w:val="28"/>
-          <w:lang w:val="en-US"/>
-        </w:rPr>
-        <w:t xml:space="preserve">Django, </w:t>
-      </w:r>
-      <w:r>
-        <w:rPr>
-          <w:color w:val="0D0D0D" w:themeColor="text1" w:themeTint="F2"/>
-          <w:sz w:val="28"/>
-          <w:szCs w:val="28"/>
-        </w:rPr>
-        <w:t>в дальнейшем при необходимости используемая база данных может быть относительно просто з</w:t>
-      </w:r>
-      <w:r>
-        <w:rPr>
-          <w:color w:val="0D0D0D" w:themeColor="text1" w:themeTint="F2"/>
-          <w:sz w:val="28"/>
-          <w:szCs w:val="28"/>
-        </w:rPr>
-        <w:t>аменена на более масштабируемую</w:t>
-      </w:r>
-      <w:r>
-        <w:rPr>
-          <w:color w:val="0D0D0D" w:themeColor="text1" w:themeTint="F2"/>
-          <w:sz w:val="28"/>
-          <w:szCs w:val="28"/>
-          <w:lang w:val="en-US"/>
-        </w:rPr>
-        <w:t xml:space="preserve">. </w:t>
-      </w:r>
-    </w:p>
-    <w:p>
-      <w:pPr>
-        <w:spacing w:line="360" w:lineRule="auto"/>
-        <w:ind w:firstLine="709"/>
-        <w:jc w:val="both"/>
-        <w:rPr>
-          <w:color w:val="0D0D0D" w:themeColor="text1" w:themeTint="F2"/>
-          <w:sz w:val="28"/>
-          <w:szCs w:val="28"/>
-        </w:rPr>
-      </w:pPr>
-      <w:r>
-        <w:rPr>
-          <w:color w:val="0D0D0D" w:themeColor="text1" w:themeTint="F2"/>
-          <w:sz w:val="28"/>
-          <w:szCs w:val="28"/>
-        </w:rPr>
-        <w:t xml:space="preserve">Одной из предпочтительных СУБД для разрабатываемой системы может быть </w:t>
-      </w:r>
-      <w:r>
-        <w:rPr>
-          <w:color w:val="0D0D0D" w:themeColor="text1" w:themeTint="F2"/>
-          <w:sz w:val="28"/>
-          <w:szCs w:val="28"/>
-          <w:lang w:val="en-US"/>
-        </w:rPr>
-        <w:t>PostgreSQL</w:t>
-      </w:r>
-      <w:r>
-        <w:rPr>
-          <w:color w:val="0D0D0D" w:themeColor="text1" w:themeTint="F2"/>
-          <w:sz w:val="28"/>
-          <w:szCs w:val="28"/>
-          <w:lang w:val="en-US"/>
-        </w:rPr>
-        <w:t xml:space="preserve"> [1</w:t>
-      </w:r>
-      <w:r>
-        <w:rPr>
-          <w:color w:val="0D0D0D" w:themeColor="text1" w:themeTint="F2"/>
-          <w:sz w:val="28"/>
-          <w:szCs w:val="28"/>
-          <w:lang w:val="en-US"/>
-        </w:rPr>
-        <w:t>1</w:t>
-      </w:r>
-      <w:r>
-        <w:rPr>
-          <w:color w:val="0D0D0D" w:themeColor="text1" w:themeTint="F2"/>
-          <w:sz w:val="28"/>
-          <w:szCs w:val="28"/>
-          <w:lang w:val="en-US"/>
-        </w:rPr>
-        <w:t>]</w:t>
-      </w:r>
-      <w:r>
-        <w:rPr>
-          <w:color w:val="0D0D0D" w:themeColor="text1" w:themeTint="F2"/>
-          <w:sz w:val="28"/>
-          <w:szCs w:val="28"/>
         </w:rPr>
         <w:t xml:space="preserve"> – свободная объектно-реляционная система управления б</w:t>
       </w:r>
@@ -7935,26 +7996,6 @@
           <w:szCs w:val="28"/>
         </w:rPr>
         <w:t>– расширяемость, выражаемая в возможности создавать пользовательские типы данных, типы индексов, модули расширения и подключать любые внешние источники данных.</w:t>
-      </w:r>
-    </w:p>
-    <w:p>
-      <w:pPr>
-        <w:spacing w:after="160" w:line="259" w:lineRule="auto"/>
-        <w:rPr>
-          <w:color w:val="0D0D0D" w:themeColor="text1" w:themeTint="F2"/>
-          <w:sz w:val="28"/>
-          <w:szCs w:val="28"/>
-          <w:lang w:val="en-US"/>
-        </w:rPr>
-      </w:pPr>
-      <w:r>
-        <w:rPr>
-          <w:color w:val="0D0D0D" w:themeColor="text1" w:themeTint="F2"/>
-          <w:sz w:val="28"/>
-          <w:szCs w:val="28"/>
-          <w:lang w:val="en-US"/>
-        </w:rPr>
-        <w:br w:type="page"/>
       </w:r>
     </w:p>
     <w:p>
@@ -12915,6 +12956,7 @@
           <w:color w:val="0D0D0D" w:themeColor="text1" w:themeTint="F2"/>
           <w:sz w:val="28"/>
           <w:szCs w:val="28"/>
+          <w:lang w:val="en-US"/>
         </w:rPr>
       </w:pPr>
       <w:r>
@@ -13033,9 +13075,242 @@
           <w:szCs w:val="28"/>
         </w:rPr>
       </w:pPr>
+      <w:r>
+        <w:rPr>
+          <w:color w:val="0D0D0D" w:themeColor="text1" w:themeTint="F2"/>
+          <w:sz w:val="28"/>
+          <w:szCs w:val="28"/>
+        </w:rPr>
+        <w:t xml:space="preserve">5. </w:t>
+      </w:r>
+      <w:r>
+        <w:rPr>
+          <w:color w:val="0D0D0D" w:themeColor="text1" w:themeTint="F2"/>
+          <w:sz w:val="28"/>
+          <w:szCs w:val="28"/>
+          <w:lang w:val="en-US"/>
+        </w:rPr>
+        <w:t>SQLite Documentation [</w:t>
+      </w:r>
+      <w:r>
+        <w:rPr>
+          <w:color w:val="0D0D0D" w:themeColor="text1" w:themeTint="F2"/>
+          <w:sz w:val="28"/>
+          <w:szCs w:val="28"/>
+        </w:rPr>
+        <w:t>Электронный ресурс</w:t>
+      </w:r>
+      <w:r>
+        <w:rPr>
+          <w:color w:val="0D0D0D" w:themeColor="text1" w:themeTint="F2"/>
+          <w:sz w:val="28"/>
+          <w:szCs w:val="28"/>
+          <w:lang w:val="en-US"/>
+        </w:rPr>
+        <w:t>]</w:t>
+      </w:r>
+      <w:r>
+        <w:rPr>
+          <w:color w:val="0D0D0D" w:themeColor="text1" w:themeTint="F2"/>
+          <w:sz w:val="28"/>
+          <w:szCs w:val="28"/>
+        </w:rPr>
+        <w:t xml:space="preserve"> – Режим доступа: </w:t>
+      </w:r>
+      <w:hyperlink r:id="rId29" w:history="1">
+        <w:r>
+          <w:rPr>
+            <w:rStyle w:val="a9"/>
+            <w:sz w:val="28"/>
+            <w:szCs w:val="28"/>
+          </w:rPr>
+          <w:t>https://www.sqlite.org/docs.html</w:t>
+        </w:r>
+      </w:hyperlink>
+      <w:r>
+        <w:rPr>
+          <w:color w:val="0D0D0D" w:themeColor="text1" w:themeTint="F2"/>
+          <w:sz w:val="28"/>
+          <w:szCs w:val="28"/>
+        </w:rPr>
+        <w:t xml:space="preserve"> </w:t>
+      </w:r>
+      <w:r>
+        <w:rPr>
+          <w:color w:val="0D0D0D" w:themeColor="text1" w:themeTint="F2"/>
+          <w:sz w:val="28"/>
+          <w:szCs w:val="28"/>
+          <w:lang w:val="en-US"/>
+        </w:rPr>
+        <w:t>(</w:t>
+      </w:r>
+      <w:r>
+        <w:rPr>
+          <w:color w:val="0D0D0D" w:themeColor="text1" w:themeTint="F2"/>
+          <w:sz w:val="28"/>
+          <w:szCs w:val="28"/>
+        </w:rPr>
+        <w:t xml:space="preserve">дата обращения: </w:t>
+      </w:r>
+      <w:r>
+        <w:rPr>
+          <w:color w:val="0D0D0D" w:themeColor="text1" w:themeTint="F2"/>
+          <w:sz w:val="28"/>
+          <w:szCs w:val="28"/>
+        </w:rPr>
+        <w:t>03.05</w:t>
+      </w:r>
+      <w:r>
+        <w:rPr>
+          <w:color w:val="0D0D0D" w:themeColor="text1" w:themeTint="F2"/>
+          <w:sz w:val="28"/>
+          <w:szCs w:val="28"/>
+        </w:rPr>
+        <w:t>.2024</w:t>
+      </w:r>
+      <w:r>
+        <w:rPr>
+          <w:color w:val="0D0D0D" w:themeColor="text1" w:themeTint="F2"/>
+          <w:sz w:val="28"/>
+          <w:szCs w:val="28"/>
+          <w:lang w:val="en-US"/>
+        </w:rPr>
+        <w:t>)</w:t>
+      </w:r>
+    </w:p>
+    <w:p>
+      <w:pPr>
+        <w:spacing w:line="360" w:lineRule="auto"/>
+        <w:ind w:firstLine="709"/>
+        <w:jc w:val="both"/>
+        <w:rPr>
+          <w:color w:val="0D0D0D" w:themeColor="text1" w:themeTint="F2"/>
+          <w:sz w:val="28"/>
+          <w:szCs w:val="28"/>
+          <w:lang w:val="en-US"/>
+        </w:rPr>
+      </w:pPr>
+      <w:r>
+        <w:rPr>
+          <w:color w:val="0D0D0D" w:themeColor="text1" w:themeTint="F2"/>
+          <w:sz w:val="28"/>
+          <w:szCs w:val="28"/>
+        </w:rPr>
+        <w:t xml:space="preserve">6. </w:t>
+      </w:r>
+      <w:r>
+        <w:rPr>
+          <w:color w:val="0D0D0D" w:themeColor="text1" w:themeTint="F2"/>
+          <w:sz w:val="28"/>
+          <w:szCs w:val="28"/>
+          <w:lang w:val="en-US"/>
+        </w:rPr>
+        <w:t>PostgreSQL: The world’s most advanced open source database [</w:t>
+      </w:r>
+      <w:r>
+        <w:rPr>
+          <w:color w:val="0D0D0D" w:themeColor="text1" w:themeTint="F2"/>
+          <w:sz w:val="28"/>
+          <w:szCs w:val="28"/>
+        </w:rPr>
+        <w:t>Электронный ресурс</w:t>
+      </w:r>
+      <w:r>
+        <w:rPr>
+          <w:color w:val="0D0D0D" w:themeColor="text1" w:themeTint="F2"/>
+          <w:sz w:val="28"/>
+          <w:szCs w:val="28"/>
+          <w:lang w:val="en-US"/>
+        </w:rPr>
+        <w:t>]</w:t>
+      </w:r>
+      <w:r>
+        <w:rPr>
+          <w:color w:val="0D0D0D" w:themeColor="text1" w:themeTint="F2"/>
+          <w:sz w:val="28"/>
+          <w:szCs w:val="28"/>
+        </w:rPr>
+        <w:t xml:space="preserve"> – Режим доступа: </w:t>
+      </w:r>
+      <w:hyperlink r:id="rId30" w:history="1">
+        <w:r>
+          <w:rPr>
+            <w:rStyle w:val="a9"/>
+            <w:sz w:val="28"/>
+            <w:szCs w:val="28"/>
+          </w:rPr>
+          <w:t>https://www.postgresql.org</w:t>
+        </w:r>
+        <w:r>
+          <w:rPr>
+            <w:rStyle w:val="a9"/>
+            <w:sz w:val="28"/>
+            <w:szCs w:val="28"/>
+            <w:lang w:val="en-US"/>
+          </w:rPr>
+          <w:t>/</w:t>
+        </w:r>
+      </w:hyperlink>
+      <w:r>
+        <w:rPr>
+          <w:color w:val="0D0D0D" w:themeColor="text1" w:themeTint="F2"/>
+          <w:sz w:val="28"/>
+          <w:szCs w:val="28"/>
+          <w:lang w:val="en-US"/>
+        </w:rPr>
+        <w:t xml:space="preserve"> </w:t>
+      </w:r>
+      <w:r>
+        <w:rPr>
+          <w:color w:val="0D0D0D" w:themeColor="text1" w:themeTint="F2"/>
+          <w:sz w:val="28"/>
+          <w:szCs w:val="28"/>
+        </w:rPr>
+        <w:t xml:space="preserve">(дата обращения: </w:t>
+      </w:r>
+      <w:r>
+        <w:rPr>
+          <w:color w:val="0D0D0D" w:themeColor="text1" w:themeTint="F2"/>
+          <w:sz w:val="28"/>
+          <w:szCs w:val="28"/>
+        </w:rPr>
+        <w:t>03.05</w:t>
+      </w:r>
+      <w:r>
+        <w:rPr>
+          <w:color w:val="0D0D0D" w:themeColor="text1" w:themeTint="F2"/>
+          <w:sz w:val="28"/>
+          <w:szCs w:val="28"/>
+        </w:rPr>
+        <w:t>.2024)</w:t>
+      </w:r>
+    </w:p>
+    <w:p>
+      <w:pPr>
+        <w:spacing w:line="360" w:lineRule="auto"/>
+        <w:ind w:firstLine="709"/>
+        <w:jc w:val="both"/>
+        <w:rPr>
+          <w:color w:val="0D0D0D" w:themeColor="text1" w:themeTint="F2"/>
+          <w:sz w:val="28"/>
+          <w:szCs w:val="28"/>
+        </w:rPr>
+      </w:pPr>
+    </w:p>
+    <w:p>
+      <w:pPr>
+        <w:spacing w:line="360" w:lineRule="auto"/>
+        <w:ind w:firstLine="709"/>
+        <w:jc w:val="both"/>
+        <w:rPr>
+          <w:color w:val="0D0D0D" w:themeColor="text1" w:themeTint="F2"/>
+          <w:sz w:val="28"/>
+          <w:szCs w:val="28"/>
+        </w:rPr>
+      </w:pPr>
     </w:p>
     <w:sectPr>
-      <w:footerReference w:type="default" r:id="rId29"/>
+      <w:footerReference w:type="default" r:id="rId31"/>
       <w:pgSz w:w="11906" w:h="16838"/>
       <w:pgMar w:top="1134" w:right="850" w:bottom="1134" w:left="1701" w:header="709" w:footer="709" w:gutter="0"/>
       <w:cols w:space="708"/>
@@ -13190,7 +13465,7 @@
             <w:sz w:val="28"/>
             <w:szCs w:val="28"/>
           </w:rPr>
-          <w:t>18</w:t>
+          <w:t>19</w:t>
         </w:r>
         <w:r>
           <w:rPr>
@@ -14314,7 +14589,7 @@
 </file>
 
 <file path=customXml/itemProps1.xml><?xml version="1.0" encoding="utf-8"?>
-<ds:datastoreItem xmlns:ds="http://schemas.openxmlformats.org/officeDocument/2006/customXml" ds:itemID="{65DABF75-4F4D-4EEE-9B89-5E543E2759D8}">
+<ds:datastoreItem xmlns:ds="http://schemas.openxmlformats.org/officeDocument/2006/customXml" ds:itemID="{BBD8BDB8-3C7E-4DBB-8E6E-5586CDBFD73B}">
   <ds:schemaRefs>
     <ds:schemaRef ds:uri="http://schemas.openxmlformats.org/officeDocument/2006/bibliography"/>
   </ds:schemaRefs>

</xml_diff>